<commit_message>
Revamp owner management flow and local development docs
</commit_message>
<xml_diff>
--- a/Architecture_Living.docx
+++ b/Architecture_Living.docx
@@ -13,7 +13,7 @@
     <w:p/>
     <w:p>
       <w:r>
-        <w:t>Last updated: 2026-03-08</w:t>
+        <w:t>Last updated: 2026-04-02</w:t>
       </w:r>
     </w:p>
     <w:p>
@@ -503,6 +503,36 @@
     <w:p/>
     <w:p>
       <w:r>
+        <w:t>Target intake extension:</w:t>
+      </w:r>
+    </w:p>
+    <w:p>
+      <w:pPr>
+        <w:pStyle w:val="ListBullet"/>
+      </w:pPr>
+      <w:r>
+        <w:t>Manual/admin submission remains the phase 1 primary path.</w:t>
+      </w:r>
+    </w:p>
+    <w:p>
+      <w:pPr>
+        <w:pStyle w:val="ListBullet"/>
+      </w:pPr>
+      <w:r>
+        <w:t>Phase 2 introduces intake adapters that normalize inbound referrals into a shared draft-case review flow.</w:t>
+      </w:r>
+    </w:p>
+    <w:p>
+      <w:pPr>
+        <w:pStyle w:val="ListBullet"/>
+      </w:pPr>
+      <w:r>
+        <w:t>Draft cases are reviewed, amended, and approved by admin before entering the active clinical workflow.</w:t>
+      </w:r>
+    </w:p>
+    <w:p/>
+    <w:p>
+      <w:r>
         <w:t>Actors:</w:t>
       </w:r>
     </w:p>
@@ -591,6 +621,36 @@
     <w:p/>
     <w:p>
       <w:r>
+        <w:t>Planned intake and attachment model:</w:t>
+      </w:r>
+    </w:p>
+    <w:p>
+      <w:pPr>
+        <w:pStyle w:val="ListBullet"/>
+      </w:pPr>
+      <w:r>
+        <w:t>Intake sources may include secure email, portal referral submission, and external system messages such as RIS/PACS or HL7-based feeds.</w:t>
+      </w:r>
+    </w:p>
+    <w:p>
+      <w:pPr>
+        <w:pStyle w:val="ListBullet"/>
+      </w:pPr>
+      <w:r>
+        <w:t>All inbound documents should be stored against the draft or active case record with source metadata preserved.</w:t>
+      </w:r>
+    </w:p>
+    <w:p>
+      <w:pPr>
+        <w:pStyle w:val="ListBullet"/>
+      </w:pPr>
+      <w:r>
+        <w:t>Original source payload, extracted fields, and approval history should remain traceable for audit and operational review.</w:t>
+      </w:r>
+    </w:p>
+    <w:p/>
+    <w:p>
+      <w:r>
         <w:t>Retention:</w:t>
       </w:r>
     </w:p>
@@ -674,7 +734,99 @@
         <w:pStyle w:val="Heading2"/>
       </w:pPr>
       <w:r>
-        <w:t>9. Architecture Weak Areas</w:t>
+        <w:t>9. Target Intake Architecture (Phase 2 Direction)</w:t>
+      </w:r>
+    </w:p>
+    <w:p>
+      <w:r>
+        <w:t>Logical target flow:</w:t>
+      </w:r>
+    </w:p>
+    <w:p>
+      <w:pPr>
+        <w:pStyle w:val="ListBullet"/>
+      </w:pPr>
+      <w:r>
+        <w:t>Intake channels: secure email inbox, portal referral form, and direct external system integration.</w:t>
+      </w:r>
+    </w:p>
+    <w:p>
+      <w:pPr>
+        <w:pStyle w:val="ListBullet"/>
+      </w:pPr>
+      <w:r>
+        <w:t>Intake adapters: channel-specific handlers for email, form, HL7, RIS, or PACS-originated payloads.</w:t>
+      </w:r>
+    </w:p>
+    <w:p>
+      <w:pPr>
+        <w:pStyle w:val="ListBullet"/>
+      </w:pPr>
+      <w:r>
+        <w:t>Normalization and validation: map inbound payloads to a common draft-case schema and flag uncertainty.</w:t>
+      </w:r>
+    </w:p>
+    <w:p>
+      <w:pPr>
+        <w:pStyle w:val="ListBullet"/>
+      </w:pPr>
+      <w:r>
+        <w:t>Draft review queue: admin checks extracted details, edits as needed, and approves or rejects.</w:t>
+      </w:r>
+    </w:p>
+    <w:p>
+      <w:pPr>
+        <w:pStyle w:val="ListBullet"/>
+      </w:pPr>
+      <w:r>
+        <w:t>Active workflow: approved drafts become standard cases and continue through assignment and vetting lifecycle.</w:t>
+      </w:r>
+    </w:p>
+    <w:p/>
+    <w:p>
+      <w:r>
+        <w:t>Design principles:</w:t>
+      </w:r>
+    </w:p>
+    <w:p>
+      <w:pPr>
+        <w:pStyle w:val="ListBullet"/>
+      </w:pPr>
+      <w:r>
+        <w:t>Different intake channels should converge on one internal draft-case model.</w:t>
+      </w:r>
+    </w:p>
+    <w:p>
+      <w:pPr>
+        <w:pStyle w:val="ListBullet"/>
+      </w:pPr>
+      <w:r>
+        <w:t>Automation should create draft cases, not directly create fully live cases.</w:t>
+      </w:r>
+    </w:p>
+    <w:p>
+      <w:pPr>
+        <w:pStyle w:val="ListBullet"/>
+      </w:pPr>
+      <w:r>
+        <w:t>Source type, original payload, attachments, and approval actions should be auditable.</w:t>
+      </w:r>
+    </w:p>
+    <w:p>
+      <w:pPr>
+        <w:pStyle w:val="ListBullet"/>
+      </w:pPr>
+      <w:r>
+        <w:t>The common workflow should allow phase-by-phase rollout of adapters without redesigning the core case model.</w:t>
+      </w:r>
+    </w:p>
+    <w:p/>
+    <w:p>
+      <w:pPr>
+        <w:pStyle w:val="Heading2"/>
+      </w:pPr>
+      <w:r>
+        <w:t>10. Architecture Weak Areas</w:t>
       </w:r>
     </w:p>
     <w:p>
@@ -708,7 +860,7 @@
         <w:pStyle w:val="Heading2"/>
       </w:pPr>
       <w:r>
-        <w:t>10. Architecture Improvement Plan</w:t>
+        <w:t>11. Architecture Improvement Plan</w:t>
       </w:r>
     </w:p>
     <w:p>
@@ -754,6 +906,14 @@
         <w:t>Introduce service layer for business logic and storage abstraction.</w:t>
       </w:r>
     </w:p>
+    <w:p>
+      <w:pPr>
+        <w:pStyle w:val="ListBullet"/>
+      </w:pPr>
+      <w:r>
+        <w:t>Introduce a draft-case intake service and normalization boundary so new channels plug into a shared workflow.</w:t>
+      </w:r>
+    </w:p>
     <w:p/>
     <w:p>
       <w:r>
@@ -774,6 +934,14 @@
       </w:pPr>
       <w:r>
         <w:t>Add explicit DB compatibility policy and migration validation in CI.</w:t>
+      </w:r>
+    </w:p>
+    <w:p>
+      <w:pPr>
+        <w:pStyle w:val="ListBullet"/>
+      </w:pPr>
+      <w:r>
+        <w:t>Add explicit source metadata, draft review, and intake audit structures where required.</w:t>
       </w:r>
     </w:p>
     <w:p/>
@@ -800,11 +968,41 @@
     </w:p>
     <w:p/>
     <w:p>
+      <w:r>
+        <w:t>Phase 5: External intake expansion</w:t>
+      </w:r>
+    </w:p>
+    <w:p>
+      <w:pPr>
+        <w:pStyle w:val="ListBullet"/>
+      </w:pPr>
+      <w:r>
+        <w:t>Add secure email-to-draft intake for approved client workflows.</w:t>
+      </w:r>
+    </w:p>
+    <w:p>
+      <w:pPr>
+        <w:pStyle w:val="ListBullet"/>
+      </w:pPr>
+      <w:r>
+        <w:t>Add portal-based referral intake for structured submission.</w:t>
+      </w:r>
+    </w:p>
+    <w:p>
+      <w:pPr>
+        <w:pStyle w:val="ListBullet"/>
+      </w:pPr>
+      <w:r>
+        <w:t>Add direct system adapters for RIS/PACS or HL7-style message ingestion where client environments support it.</w:t>
+      </w:r>
+    </w:p>
+    <w:p/>
+    <w:p>
       <w:pPr>
         <w:pStyle w:val="Heading2"/>
       </w:pPr>
       <w:r>
-        <w:t>11. Non-Functional Targets (Suggested)</w:t>
+        <w:t>12. Non-Functional Targets (Suggested)</w:t>
       </w:r>
     </w:p>
     <w:p>
@@ -845,7 +1043,15 @@
         <w:pStyle w:val="Heading2"/>
       </w:pPr>
       <w:r>
-        <w:t>12. Update Log</w:t>
+        <w:t>13. Update Log</w:t>
+      </w:r>
+    </w:p>
+    <w:p>
+      <w:pPr>
+        <w:pStyle w:val="ListBullet"/>
+      </w:pPr>
+      <w:r>
+        <w:t>2026-04-02: Added target intake architecture and phased draft-case expansion model.</w:t>
       </w:r>
     </w:p>
     <w:p>
@@ -862,7 +1068,7 @@
         <w:pStyle w:val="Heading2"/>
       </w:pPr>
       <w:r>
-        <w:t>13. Update Template (append on each revision)</w:t>
+        <w:t>14. Update Template (append on each revision)</w:t>
       </w:r>
     </w:p>
     <w:p>

</xml_diff>